<commit_message>
The syllabus gets its sign and return page; two print fixes (D106)
The syllabus promised "sign and return the last page" and had no such page. It now ends with one: student and family signatures, a family contact line, the food allergy and food rule lines the syllabus asks for, and an optional line for a skill to share. The technology section names the site's games and the class username. On paper a rule in a document is a page break, and the home page's sprinkle shapes no longer print over the opening paragraph.

Co-Authored-By: Claude Fable 5.1 <noreply@anthropic.com>
Claude-Session: https://claude.ai/code/session_01TaQLEJCtq2ruLJPqxdFc8k
</commit_message>
<xml_diff>
--- a/downloads/documents/03 Course Design/00 Syllabus.docx
+++ b/downloads/documents/03 Course Design/00 Syllabus.docx
@@ -900,7 +900,7 @@
         <w:pStyle w:val="FirstParagraph"/>
       </w:pPr>
       <w:r>
-        <w:t xml:space="preserve">We use a few web tools in class, including ClassroomStreet.com, a financial simulation I built. You log in with a class number and a PIN. No personal information goes into it.</w:t>
+        <w:t xml:space="preserve">We use a few web tools in class, including ClassroomStreet.com, a financial simulation I built. You log in with a class number and a PIN. No personal information goes into it. The course website, lifeskillsarcade.com, has short review games for every unit. I may give you a username like facs-6a-17 and a PIN so your best score on each game counts on our class leaderboard. The site never stores your name.</w:t>
       </w:r>
     </w:p>
     <w:p>
@@ -971,6 +971,119 @@
       </w:pPr>
       <w:r>
         <w:t xml:space="preserve">Sign and return the last page.</w:t>
+      </w:r>
+    </w:p>
+    <w:p>
+      <w:r>
+        <w:br w:type="page"/>
+      </w:r>
+    </w:p>
+    <w:p>
+      <w:pPr>
+        <w:pStyle w:val="Heading2"/>
+      </w:pPr>
+      <w:bookmarkStart w:id="33" w:name="sign-and-return"/>
+      <w:r>
+        <w:t xml:space="preserve">Sign and return</w:t>
+      </w:r>
+      <w:bookmarkEnd w:id="33"/>
+    </w:p>
+    <w:p>
+      <w:pPr>
+        <w:pStyle w:val="FirstParagraph"/>
+      </w:pPr>
+      <w:r>
+        <w:t xml:space="preserve">I have read the syllabus for Family and Consumer Sciences, grades 6 to 8, including how the room works, how grades work, and the food rules.</w:t>
+      </w:r>
+    </w:p>
+    <w:p>
+      <w:pPr>
+        <w:pStyle w:val="BodyText"/>
+      </w:pPr>
+      <w:r>
+        <w:t xml:space="preserve">Student name (print): ______________________________ Period: ______</w:t>
+      </w:r>
+    </w:p>
+    <w:p>
+      <w:pPr>
+        <w:pStyle w:val="BodyText"/>
+      </w:pPr>
+      <w:r>
+        <w:t xml:space="preserve">Student signature: ______________________________ Date: ______</w:t>
+      </w:r>
+    </w:p>
+    <w:p>
+      <w:pPr>
+        <w:pStyle w:val="BodyText"/>
+      </w:pPr>
+      <w:r>
+        <w:t xml:space="preserve">Family member name (print): ______________________________</w:t>
+      </w:r>
+    </w:p>
+    <w:p>
+      <w:pPr>
+        <w:pStyle w:val="BodyText"/>
+      </w:pPr>
+      <w:r>
+        <w:t xml:space="preserve">Family member signature: ______________________________ Date: ______</w:t>
+      </w:r>
+    </w:p>
+    <w:p>
+      <w:pPr>
+        <w:pStyle w:val="BodyText"/>
+      </w:pPr>
+      <w:r>
+        <w:t xml:space="preserve">Best phone or email for a family member: ______________________________</w:t>
+      </w:r>
+    </w:p>
+    <w:p>
+      <w:pPr>
+        <w:pStyle w:val="BodyText"/>
+      </w:pPr>
+      <w:r>
+        <w:t xml:space="preserve">Food allergies or food rules I should know about (religious, medical, or family). Write</w:t>
+      </w:r>
+      <w:r>
+        <w:t xml:space="preserve"> </w:t>
+      </w:r>
+      <w:r>
+        <w:t xml:space="preserve">“</w:t>
+      </w:r>
+      <w:r>
+        <w:t xml:space="preserve">none</w:t>
+      </w:r>
+      <w:r>
+        <w:t xml:space="preserve">”</w:t>
+      </w:r>
+      <w:r>
+        <w:t xml:space="preserve"> </w:t>
+      </w:r>
+      <w:r>
+        <w:t xml:space="preserve">if there are none.</w:t>
+      </w:r>
+    </w:p>
+    <w:p>
+      <w:pPr>
+        <w:pStyle w:val="BodyText"/>
+      </w:pPr>
+      <w:r>
+        <w:t xml:space="preserve">Allergy or rule: ______________________________________________</w:t>
+      </w:r>
+    </w:p>
+    <w:p>
+      <w:pPr>
+        <w:pStyle w:val="BodyText"/>
+      </w:pPr>
+      <w:r>
+        <w:t xml:space="preserve">Allergy or rule: ______________________________________________</w:t>
+      </w:r>
+    </w:p>
+    <w:p>
+      <w:pPr>
+        <w:pStyle w:val="BodyText"/>
+      </w:pPr>
+      <w:r>
+        <w:t xml:space="preserve">A skill, recipe, craft, or job you would be willing to share with the class for ten minutes (optional): ______________________________</w:t>
       </w:r>
     </w:p>
     <w:sectPr>

</xml_diff>